<commit_message>
docs: add FR-016/TR-016 trace and RTM column H-L note
Traces FR-016 end to end (STK-03/STK-04 -> requirement -> acceptance criteria
-> RTM row TR-016), verifying the chain holds against RSK-09 and FEC-02. Adds a
note to s9.1 on what will fill RTM columns H-L at M2 and M3 for this
requirement.

Rebased onto main by Jean Smit after PR #30 merged: this branch was cut from
800b982, before Darius's own AI Usage Register commits landed, so the PED
conflicted. Content is unchanged from f1ede9b; only the base moved. Authorship
retained.

Refs: #13, RSK-09
</commit_message>
<xml_diff>
--- a/docs/PED/CivicConnect_PED_v1.0.docx
+++ b/docs/PED/CivicConnect_PED_v1.0.docx
@@ -26998,6 +26998,225 @@
       <w:pPr>
         <w:pageBreakBefore/>
       </w:pPr>
+    </w:p>
+    <w:tbl>
+      <w:tblPr>
+        <w:tblStyle w:val="ListTable6Colourful"/>
+        <w:tblW w:w="0" w:type="auto"/>
+        <w:tblLook w:val="04A0" w:firstRow="1" w:lastRow="0" w:firstColumn="1" w:lastColumn="0" w:noHBand="0" w:noVBand="1"/>
+      </w:tblPr>
+      <w:tblGrid>
+        <w:gridCol w:w="1859"/>
+        <w:gridCol w:w="7553"/>
+      </w:tblGrid>
+      <w:tr>
+        <w:trPr>
+          <w:cnfStyle w:val="100000000000" w:firstRow="1" w:lastRow="0" w:firstColumn="0" w:lastColumn="0" w:oddVBand="0" w:evenVBand="0" w:oddHBand="0" w:evenHBand="0" w:firstRowFirstColumn="0" w:firstRowLastColumn="0" w:lastRowFirstColumn="0" w:lastRowLastColumn="0"/>
+        </w:trPr>
+        <w:tc>
+          <w:tcPr>
+            <w:cnfStyle w:val="001000000000" w:firstRow="0" w:lastRow="0" w:firstColumn="1" w:lastColumn="0" w:oddVBand="0" w:evenVBand="0" w:oddHBand="0" w:evenHBand="0" w:firstRowFirstColumn="0" w:firstRowLastColumn="0" w:lastRowFirstColumn="0" w:lastRowLastColumn="0"/>
+            <w:tcW w:w="0" w:type="auto"/>
+            <w:hideMark/>
+          </w:tcPr>
+          <w:p>
+            <w:r>
+              <w:t>Link in the chain</w:t>
+            </w:r>
+          </w:p>
+        </w:tc>
+        <w:tc>
+          <w:tcPr>
+            <w:tcW w:w="0" w:type="auto"/>
+            <w:hideMark/>
+          </w:tcPr>
+          <w:p>
+            <w:pPr>
+              <w:cnfStyle w:val="100000000000" w:firstRow="1" w:lastRow="0" w:firstColumn="0" w:lastColumn="0" w:oddVBand="0" w:evenVBand="0" w:oddHBand="0" w:evenHBand="0" w:firstRowFirstColumn="0" w:firstRowLastColumn="0" w:lastRowFirstColumn="0" w:lastRowLastColumn="0"/>
+            </w:pPr>
+            <w:r>
+              <w:t>Evidence today</w:t>
+            </w:r>
+          </w:p>
+        </w:tc>
+      </w:tr>
+      <w:tr>
+        <w:trPr>
+          <w:cnfStyle w:val="000000100000" w:firstRow="0" w:lastRow="0" w:firstColumn="0" w:lastColumn="0" w:oddVBand="0" w:evenVBand="0" w:oddHBand="1" w:evenHBand="0" w:firstRowFirstColumn="0" w:firstRowLastColumn="0" w:lastRowFirstColumn="0" w:lastRowLastColumn="0"/>
+        </w:trPr>
+        <w:tc>
+          <w:tcPr>
+            <w:cnfStyle w:val="001000000000" w:firstRow="0" w:lastRow="0" w:firstColumn="1" w:lastColumn="0" w:oddVBand="0" w:evenVBand="0" w:oddHBand="0" w:evenHBand="0" w:firstRowFirstColumn="0" w:firstRowLastColumn="0" w:lastRowFirstColumn="0" w:lastRowLastColumn="0"/>
+            <w:tcW w:w="0" w:type="auto"/>
+            <w:hideMark/>
+          </w:tcPr>
+          <w:p>
+            <w:r>
+              <w:t>Stakeholder need</w:t>
+            </w:r>
+          </w:p>
+        </w:tc>
+        <w:tc>
+          <w:tcPr>
+            <w:tcW w:w="0" w:type="auto"/>
+            <w:hideMark/>
+          </w:tcPr>
+          <w:p>
+            <w:pPr>
+              <w:cnfStyle w:val="000000100000" w:firstRow="0" w:lastRow="0" w:firstColumn="0" w:lastColumn="0" w:oddVBand="0" w:evenVBand="0" w:oddHBand="1" w:evenHBand="0" w:firstRowFirstColumn="0" w:firstRowLastColumn="0" w:lastRowFirstColumn="0" w:lastRowLastColumn="0"/>
+            </w:pPr>
+            <w:r>
+              <w:t>STK-03, Coordinator: "reliable prioritisation, clear ownership of every request." STK-04, Management: "an auditable record of who changed what."</w:t>
+            </w:r>
+          </w:p>
+        </w:tc>
+      </w:tr>
+      <w:tr>
+        <w:tc>
+          <w:tcPr>
+            <w:cnfStyle w:val="001000000000" w:firstRow="0" w:lastRow="0" w:firstColumn="1" w:lastColumn="0" w:oddVBand="0" w:evenVBand="0" w:oddHBand="0" w:evenHBand="0" w:firstRowFirstColumn="0" w:firstRowLastColumn="0" w:lastRowFirstColumn="0" w:lastRowLastColumn="0"/>
+            <w:tcW w:w="0" w:type="auto"/>
+            <w:hideMark/>
+          </w:tcPr>
+          <w:p>
+            <w:r>
+              <w:t>Business need</w:t>
+            </w:r>
+          </w:p>
+        </w:tc>
+        <w:tc>
+          <w:tcPr>
+            <w:tcW w:w="0" w:type="auto"/>
+            <w:hideMark/>
+          </w:tcPr>
+          <w:p>
+            <w:pPr>
+              <w:cnfStyle w:val="000000000000" w:firstRow="0" w:lastRow="0" w:firstColumn="0" w:lastColumn="0" w:oddVBand="0" w:evenVBand="0" w:oddHBand="0" w:evenHBand="0" w:firstRowFirstColumn="0" w:firstRowLastColumn="0" w:lastRowFirstColumn="0" w:lastRowLastColumn="0"/>
+            </w:pPr>
+            <w:r>
+              <w:t>Requests must move through a controlled, auditable workflow rather than an ad-hoc handoff between staff.</w:t>
+            </w:r>
+          </w:p>
+        </w:tc>
+      </w:tr>
+      <w:tr>
+        <w:trPr>
+          <w:cnfStyle w:val="000000100000" w:firstRow="0" w:lastRow="0" w:firstColumn="0" w:lastColumn="0" w:oddVBand="0" w:evenVBand="0" w:oddHBand="1" w:evenHBand="0" w:firstRowFirstColumn="0" w:firstRowLastColumn="0" w:lastRowFirstColumn="0" w:lastRowLastColumn="0"/>
+        </w:trPr>
+        <w:tc>
+          <w:tcPr>
+            <w:cnfStyle w:val="001000000000" w:firstRow="0" w:lastRow="0" w:firstColumn="1" w:lastColumn="0" w:oddVBand="0" w:evenVBand="0" w:oddHBand="0" w:evenHBand="0" w:firstRowFirstColumn="0" w:firstRowLastColumn="0" w:lastRowFirstColumn="0" w:lastRowLastColumn="0"/>
+            <w:tcW w:w="0" w:type="auto"/>
+            <w:hideMark/>
+          </w:tcPr>
+          <w:p>
+            <w:r>
+              <w:t>Requirement</w:t>
+            </w:r>
+          </w:p>
+        </w:tc>
+        <w:tc>
+          <w:tcPr>
+            <w:tcW w:w="0" w:type="auto"/>
+            <w:hideMark/>
+          </w:tcPr>
+          <w:p>
+            <w:pPr>
+              <w:cnfStyle w:val="000000100000" w:firstRow="0" w:lastRow="0" w:firstColumn="0" w:lastColumn="0" w:oddVBand="0" w:evenVBand="0" w:oddHBand="1" w:evenHBand="0" w:firstRowFirstColumn="0" w:firstRowLastColumn="0" w:lastRowFirstColumn="0" w:lastRowLastColumn="0"/>
+            </w:pPr>
+            <w:r>
+              <w:t>FR-016: the system shall permit a status change only where the transition is allowed by the request status model (Figure 2) and only by an authorised role. Priority Must. Source STK-03, STK-04.</w:t>
+            </w:r>
+          </w:p>
+        </w:tc>
+      </w:tr>
+      <w:tr>
+        <w:tc>
+          <w:tcPr>
+            <w:cnfStyle w:val="001000000000" w:firstRow="0" w:lastRow="0" w:firstColumn="1" w:lastColumn="0" w:oddVBand="0" w:evenVBand="0" w:oddHBand="0" w:evenHBand="0" w:firstRowFirstColumn="0" w:firstRowLastColumn="0" w:lastRowFirstColumn="0" w:lastRowLastColumn="0"/>
+            <w:tcW w:w="0" w:type="auto"/>
+            <w:hideMark/>
+          </w:tcPr>
+          <w:p>
+            <w:r>
+              <w:t>Acceptance criteria</w:t>
+            </w:r>
+          </w:p>
+        </w:tc>
+        <w:tc>
+          <w:tcPr>
+            <w:tcW w:w="0" w:type="auto"/>
+            <w:hideMark/>
+          </w:tcPr>
+          <w:p>
+            <w:pPr>
+              <w:cnfStyle w:val="000000000000" w:firstRow="0" w:lastRow="0" w:firstColumn="0" w:lastColumn="0" w:oddVBand="0" w:evenVBand="0" w:oddHBand="0" w:evenHBand="0" w:firstRowFirstColumn="0" w:firstRowLastColumn="0" w:lastRowFirstColumn="0" w:lastRowLastColumn="0"/>
+            </w:pPr>
+            <w:r>
+              <w:t>Every allowed transition succeeds for an authorised role; every disallowed transition is refused, including when issued directly to the endpoint. Stored status remains unchanged on refusal.</w:t>
+            </w:r>
+          </w:p>
+        </w:tc>
+      </w:tr>
+      <w:tr>
+        <w:trPr>
+          <w:cnfStyle w:val="000000100000" w:firstRow="0" w:lastRow="0" w:firstColumn="0" w:lastColumn="0" w:oddVBand="0" w:evenVBand="0" w:oddHBand="1" w:evenHBand="0" w:firstRowFirstColumn="0" w:firstRowLastColumn="0" w:lastRowFirstColumn="0" w:lastRowLastColumn="0"/>
+        </w:trPr>
+        <w:tc>
+          <w:tcPr>
+            <w:cnfStyle w:val="001000000000" w:firstRow="0" w:lastRow="0" w:firstColumn="1" w:lastColumn="0" w:oddVBand="0" w:evenVBand="0" w:oddHBand="0" w:evenHBand="0" w:firstRowFirstColumn="0" w:firstRowLastColumn="0" w:lastRowFirstColumn="0" w:lastRowLastColumn="0"/>
+            <w:tcW w:w="0" w:type="auto"/>
+            <w:hideMark/>
+          </w:tcPr>
+          <w:p>
+            <w:r>
+              <w:t>Decision/risk it depends on</w:t>
+            </w:r>
+          </w:p>
+        </w:tc>
+        <w:tc>
+          <w:tcPr>
+            <w:tcW w:w="0" w:type="auto"/>
+            <w:hideMark/>
+          </w:tcPr>
+          <w:p>
+            <w:pPr>
+              <w:cnfStyle w:val="000000100000" w:firstRow="0" w:lastRow="0" w:firstColumn="0" w:lastColumn="0" w:oddVBand="0" w:evenVBand="0" w:oddHBand="1" w:evenHBand="0" w:firstRowFirstColumn="0" w:firstRowLastColumn="0" w:lastRowFirstColumn="0" w:lastRowLastColumn="0"/>
+            </w:pPr>
+            <w:r>
+              <w:t>RSK-09 (status model proves ambiguous later) and FEC-02 (status model stability) — decided inside M1, per Figure 1, because the cost of reversal rises the moment the first real request exists.</w:t>
+            </w:r>
+          </w:p>
+        </w:tc>
+      </w:tr>
+    </w:tbl>
+    <w:p>
+      <w:pPr>
+        <w:pageBreakBefore/>
+      </w:pPr>
+    </w:p>
+    <w:p>
+      <w:r>
+        <w:t>At M2, column H (Design ref) will hold the architecture or state-diagram reference showing where FR-016's transition guard is implemented. At M3, columns I</w:t>
+      </w:r>
+      <w:r>
+        <w:t xml:space="preserve"> - </w:t>
+      </w:r>
+      <w:r>
+        <w:t>K will hold the issue/PR building the guard logic, its implementation reference, and the automated test reference proving the acceptance criteria</w:t>
+      </w:r>
+      <w:r>
+        <w:t xml:space="preserve">, </w:t>
+      </w:r>
+      <w:r>
+        <w:t xml:space="preserve"> including the direct-to-endpoint negative case</w:t>
+      </w:r>
+      <w:r>
+        <w:t xml:space="preserve">, </w:t>
+      </w:r>
+      <w:r>
+        <w:t xml:space="preserve"> actually passes.</w:t>
+      </w:r>
     </w:p>
     <w:p>
       <w:pPr>

</xml_diff>

<commit_message>
docs: make the PED AI Usage Register mirror agree with the workbook
Raised by Tristan in review of #18. The workbook carried Darius's completed
entry while the PED mirror carried only his name, leaving Date, Tool,
Engineering task, AI contribution, Verification performed, Decision and Issues
found as placeholders. Seven of eight cells disagreed.

The gap originated in commit f2e9459, which replaced the [Member 3] token in
the PED without carrying across the row content, and it survived the rebuild
because the restack reproduced that commit faithfully rather than questioning
it.

Two controlled copies of the same register stating different things about the
same member's AI use is precisely the inconsistency Master Brief s6.1 and the
PED quality criterion look for. All six rows now match cell for cell across
both artefacts.

Refs: #18, #10, Master Brief s6.1, s10.1
</commit_message>
<xml_diff>
--- a/docs/PED/CivicConnect_PED_v1.0.docx
+++ b/docs/PED/CivicConnect_PED_v1.0.docx
@@ -44995,7 +44995,7 @@
                 <w:sz w:val="18"/>
                 <w:szCs w:val="18"/>
               </w:rPr>
-              <w:t xml:space="preserve">[Date]</w:t>
+              <w:t xml:space="preserve">2026-09-08</w:t>
             </w:r>
           </w:p>
         </w:tc>
@@ -45059,7 +45059,7 @@
                 <w:sz w:val="18"/>
                 <w:szCs w:val="18"/>
               </w:rPr>
-              <w:t xml:space="preserve">[Tool and version]</w:t>
+              <w:t xml:space="preserve">AI chat assistant</w:t>
             </w:r>
           </w:p>
         </w:tc>
@@ -45091,7 +45091,7 @@
                 <w:sz w:val="18"/>
                 <w:szCs w:val="18"/>
               </w:rPr>
-              <w:t xml:space="preserve">[Task]</w:t>
+              <w:t xml:space="preserve">Understanding and preparing to defend PED s8 (functional and non-functional requirements) and owned risks RSK-03, RSK-06, RSK-09, RSK-12 ahead of the M1 engineering defence; inspecting the repository's actual commit history for authenticity</w:t>
             </w:r>
           </w:p>
         </w:tc>
@@ -45123,7 +45123,7 @@
                 <w:sz w:val="18"/>
                 <w:szCs w:val="18"/>
               </w:rPr>
-              <w:t xml:space="preserve">[Contribution]</w:t>
+              <w:t xml:space="preserve">Explained the rationale linking requirement structure to ISO/IEC/IEEE 29148:2018, traced connections between FR/NFR items and owned risks, generated practice questions, and retrieved the repository's commit history via git commands</w:t>
             </w:r>
           </w:p>
         </w:tc>
@@ -45155,7 +45155,7 @@
                 <w:sz w:val="18"/>
                 <w:szCs w:val="18"/>
               </w:rPr>
-              <w:t xml:space="preserve">[How you verified it independently]</w:t>
+              <w:t xml:space="preserve">Re-ran git log --all --stat myself against the live repository and confirmed the commit history, authorship and file changes matched what the assistant reported</w:t>
             </w:r>
           </w:p>
         </w:tc>
@@ -45187,7 +45187,7 @@
                 <w:sz w:val="18"/>
                 <w:szCs w:val="18"/>
               </w:rPr>
-              <w:t xml:space="preserve">[Accepted / Rejected / Accepted after revision]</w:t>
+              <w:t xml:space="preserve">Accepted as a study aid; the commit-history finding was treated as something to raise with the team, not taken at face value</w:t>
             </w:r>
           </w:p>
         </w:tc>
@@ -45219,7 +45219,7 @@
                 <w:sz w:val="18"/>
                 <w:szCs w:val="18"/>
               </w:rPr>
-              <w:t xml:space="preserve">[What was wrong]</w:t>
+              <w:t xml:space="preserve">The assistant could not assess repository authenticity from a ZIP export alone (no .git history included) until the live repository URL was supplied; a snapshot without history can look complete while hiding whether the process was authentic</w:t>
             </w:r>
           </w:p>
         </w:tc>

</xml_diff>

<commit_message>
docs: complete Tristan AI Usage Register entry
Records Tristan Roets's M1 AI-assisted work in the controlled register and the
PED s14.2 mirror: the engineering task, what the assistant contributed, the
independent verification applied, and what was accepted after revision or
rejected.

Content supplied by Tristan Roets. Committed from Jean Smit's account because
he could not reach a machine tonight, and at his explicit request the commit is
not attributed to him: the authorship reflects who made the commit, and this
message records whose work it is.

His verification is checked against the live repository rather than asserted,
and the issues-found column records that some assistant output rested on an
outdated view of repository state and was corrected or rejected against the
live evidence.

All six register rows are now filled and the workbook and PED copies agree cell
for cell.

Refs: #4
</commit_message>
<xml_diff>
--- a/docs/PED/CivicConnect_PED_v1.0.docx
+++ b/docs/PED/CivicConnect_PED_v1.0.docx
@@ -44781,7 +44781,7 @@
                 <w:sz w:val="18"/>
                 <w:szCs w:val="18"/>
               </w:rPr>
-              <w:t xml:space="preserve">[Date]</w:t>
+              <w:t xml:space="preserve">2026-09-09</w:t>
             </w:r>
           </w:p>
         </w:tc>
@@ -44813,7 +44813,7 @@
                 <w:sz w:val="18"/>
                 <w:szCs w:val="18"/>
               </w:rPr>
-              <w:t xml:space="preserve">[Member 2]</w:t>
+              <w:t xml:space="preserve">Tristan Roets</w:t>
             </w:r>
           </w:p>
         </w:tc>
@@ -44845,7 +44845,7 @@
                 <w:sz w:val="18"/>
                 <w:szCs w:val="18"/>
               </w:rPr>
-              <w:t xml:space="preserve">[Tool and version]</w:t>
+              <w:t xml:space="preserve">ChatGPT (OpenAI, GPT-5.6 Sol)</w:t>
             </w:r>
           </w:p>
         </w:tc>
@@ -44877,7 +44877,7 @@
                 <w:sz w:val="18"/>
                 <w:szCs w:val="18"/>
               </w:rPr>
-              <w:t xml:space="preserve">Reviewing the risk register for gaps</w:t>
+              <w:t xml:space="preserve">Reviewing M1 GitHub pull requests and preparing Risk Register and Forward Engineering Consideration evidence</w:t>
             </w:r>
           </w:p>
         </w:tc>
@@ -44909,7 +44909,7 @@
                 <w:sz w:val="18"/>
                 <w:szCs w:val="18"/>
               </w:rPr>
-              <w:t xml:space="preserve">Suggested additional risk candidates</w:t>
+              <w:t xml:space="preserve">Assisted with identifying review blockers, checking traceability and governance issues, drafting review wording, and structuring Risk Register and FEC notes.</w:t>
             </w:r>
           </w:p>
         </w:tc>
@@ -44941,7 +44941,7 @@
                 <w:sz w:val="18"/>
                 <w:szCs w:val="18"/>
               </w:rPr>
-              <w:t xml:space="preserve">Each candidate assessed against the actual project constraints in PED s7; generic entries with no CivicConnect-specific cause were rejected.</w:t>
+              <w:t xml:space="preserve">Compared the recommendations against the live GitHub pull requests, current main branch, CONTRIBUTING.md, issue requirements, and the controlled workbook and PED before accepting or revising them.</w:t>
             </w:r>
           </w:p>
         </w:tc>
@@ -44973,7 +44973,7 @@
                 <w:sz w:val="18"/>
                 <w:szCs w:val="18"/>
               </w:rPr>
-              <w:t xml:space="preserve">Partially accepted</w:t>
+              <w:t xml:space="preserve">Accepted after revision</w:t>
             </w:r>
           </w:p>
         </w:tc>
@@ -45005,7 +45005,7 @@
                 <w:sz w:val="18"/>
                 <w:szCs w:val="18"/>
               </w:rPr>
-              <w:t xml:space="preserve">[Record which suggestions were rejected and why]</w:t>
+              <w:t xml:space="preserve">Some suggestions were based on incomplete or outdated repository state. These were rechecked against the live repository, corrected where necessary, and unsupported claims were rejected.</w:t>
             </w:r>
           </w:p>
         </w:tc>

</xml_diff>

<commit_message>
docs: name the three approvers on the baseline sign-off
The three approval rows read "Team approval - [Member 1]" and so on, in the
workbook sheet and the PED s16 mirror. The names were never unknown; only the
approvals are outstanding.

They now carry the registered members. The Signature and date column stays
empty, as do the date, the six readiness fields, the outcome, the conditions
and the assessor decision, because the gate is on 10 September and none of
those has happened.

The distinction matters for how the sheet reads. Placeholders where the names
belong make a sign-off look unfinished; named approvers with empty signature
fields make it look like what it is, a gate that has not yet been held. Master
Brief s23 values honest incompleteness over the appearance of completeness, but
that only holds when the incompleteness is the real kind.

Refs: #7, Master Brief Appendix D
</commit_message>
<xml_diff>
--- a/docs/PED/CivicConnect_PED_v1.0.docx
+++ b/docs/PED/CivicConnect_PED_v1.0.docx
@@ -47796,7 +47796,7 @@
                 <w:sz w:val="19"/>
                 <w:szCs w:val="19"/>
               </w:rPr>
-              <w:t xml:space="preserve">Team approval - [Member 1]</w:t>
+              <w:t xml:space="preserve">Team approval - Jean Smit</w:t>
             </w:r>
           </w:p>
         </w:tc>
@@ -47870,7 +47870,7 @@
                 <w:sz w:val="19"/>
                 <w:szCs w:val="19"/>
               </w:rPr>
-              <w:t xml:space="preserve">Team approval - [Member 2]</w:t>
+              <w:t xml:space="preserve">Team approval - Tristan Roets</w:t>
             </w:r>
           </w:p>
         </w:tc>
@@ -47944,7 +47944,7 @@
                 <w:sz w:val="19"/>
                 <w:szCs w:val="19"/>
               </w:rPr>
-              <w:t xml:space="preserve">Team approval - [Member 3]</w:t>
+              <w:t xml:space="preserve">Team approval - Darius Mushi</w:t>
             </w:r>
           </w:p>
         </w:tc>

</xml_diff>

<commit_message>
docs: complete Tristan AI Usage Register entry (#39)
Records Tristan Roets's M1 AI-assisted work in the controlled register and the
PED s14.2 mirror: the engineering task, what the assistant contributed, the
independent verification applied, and what was accepted after revision or
rejected.

Content supplied by Tristan Roets. Committed from Jean Smit's account because
he could not reach a machine tonight, and at his explicit request the commit is
not attributed to him: the authorship reflects who made the commit, and this
message records whose work it is.

His verification is checked against the live repository rather than asserted,
and the issues-found column records that some assistant output rested on an
outdated view of repository state and was corrected or rejected against the
live evidence.

All six register rows are now filled and the workbook and PED copies agree cell
for cell.

Refs: #4
</commit_message>
<xml_diff>
--- a/docs/PED/CivicConnect_PED_v1.0.docx
+++ b/docs/PED/CivicConnect_PED_v1.0.docx
@@ -44781,7 +44781,7 @@
                 <w:sz w:val="18"/>
                 <w:szCs w:val="18"/>
               </w:rPr>
-              <w:t xml:space="preserve">[Date]</w:t>
+              <w:t xml:space="preserve">2026-09-09</w:t>
             </w:r>
           </w:p>
         </w:tc>
@@ -44813,7 +44813,7 @@
                 <w:sz w:val="18"/>
                 <w:szCs w:val="18"/>
               </w:rPr>
-              <w:t xml:space="preserve">[Member 2]</w:t>
+              <w:t xml:space="preserve">Tristan Roets</w:t>
             </w:r>
           </w:p>
         </w:tc>
@@ -44845,7 +44845,7 @@
                 <w:sz w:val="18"/>
                 <w:szCs w:val="18"/>
               </w:rPr>
-              <w:t xml:space="preserve">[Tool and version]</w:t>
+              <w:t xml:space="preserve">ChatGPT (OpenAI, GPT-5.6 Sol)</w:t>
             </w:r>
           </w:p>
         </w:tc>
@@ -44877,7 +44877,7 @@
                 <w:sz w:val="18"/>
                 <w:szCs w:val="18"/>
               </w:rPr>
-              <w:t xml:space="preserve">Reviewing the risk register for gaps</w:t>
+              <w:t xml:space="preserve">Reviewing M1 GitHub pull requests and preparing Risk Register and Forward Engineering Consideration evidence</w:t>
             </w:r>
           </w:p>
         </w:tc>
@@ -44909,7 +44909,7 @@
                 <w:sz w:val="18"/>
                 <w:szCs w:val="18"/>
               </w:rPr>
-              <w:t xml:space="preserve">Suggested additional risk candidates</w:t>
+              <w:t xml:space="preserve">Assisted with identifying review blockers, checking traceability and governance issues, drafting review wording, and structuring Risk Register and FEC notes.</w:t>
             </w:r>
           </w:p>
         </w:tc>
@@ -44941,7 +44941,7 @@
                 <w:sz w:val="18"/>
                 <w:szCs w:val="18"/>
               </w:rPr>
-              <w:t xml:space="preserve">Each candidate assessed against the actual project constraints in PED s7; generic entries with no CivicConnect-specific cause were rejected.</w:t>
+              <w:t xml:space="preserve">Compared the recommendations against the live GitHub pull requests, current main branch, CONTRIBUTING.md, issue requirements, and the controlled workbook and PED before accepting or revising them.</w:t>
             </w:r>
           </w:p>
         </w:tc>
@@ -44973,7 +44973,7 @@
                 <w:sz w:val="18"/>
                 <w:szCs w:val="18"/>
               </w:rPr>
-              <w:t xml:space="preserve">Partially accepted</w:t>
+              <w:t xml:space="preserve">Accepted after revision</w:t>
             </w:r>
           </w:p>
         </w:tc>
@@ -45005,7 +45005,7 @@
                 <w:sz w:val="18"/>
                 <w:szCs w:val="18"/>
               </w:rPr>
-              <w:t xml:space="preserve">[Record which suggestions were rejected and why]</w:t>
+              <w:t xml:space="preserve">Some suggestions were based on incomplete or outdated repository state. These were rechecked against the live repository, corrected where necessary, and unsupported claims were rejected.</w:t>
             </w:r>
           </w:p>
         </w:tc>

</xml_diff>